<commit_message>
update ementa e upload leituras
</commit_message>
<xml_diff>
--- a/EMENTA/Ementa_Fundamentos-de-Politicas-Publicas_2026.2.docx
+++ b/EMENTA/Ementa_Fundamentos-de-Politicas-Publicas_2026.2.docx
@@ -374,43 +374,7 @@
             <w:sz w:val="22"/>
             <w:lang w:val="pt-BR"/>
           </w:rPr>
-          <w:t>Micros</w:t>
-        </w:r>
-        <w:r>
-          <w:rPr>
-            <w:rStyle w:val="Hyperlink"/>
-            <w:rFonts w:ascii="Arial" w:hAnsi="Arial" w:cs="Arial"/>
-            <w:sz w:val="22"/>
-            <w:lang w:val="pt-BR"/>
-          </w:rPr>
-          <w:t>o</w:t>
-        </w:r>
-        <w:r>
-          <w:rPr>
-            <w:rStyle w:val="Hyperlink"/>
-            <w:rFonts w:ascii="Arial" w:hAnsi="Arial" w:cs="Arial"/>
-            <w:sz w:val="22"/>
-            <w:lang w:val="pt-BR"/>
-          </w:rPr>
-          <w:t>ft Te</w:t>
-        </w:r>
-        <w:r>
-          <w:rPr>
-            <w:rStyle w:val="Hyperlink"/>
-            <w:rFonts w:ascii="Arial" w:hAnsi="Arial" w:cs="Arial"/>
-            <w:sz w:val="22"/>
-            <w:lang w:val="pt-BR"/>
-          </w:rPr>
-          <w:t>a</w:t>
-        </w:r>
-        <w:r>
-          <w:rPr>
-            <w:rStyle w:val="Hyperlink"/>
-            <w:rFonts w:ascii="Arial" w:hAnsi="Arial" w:cs="Arial"/>
-            <w:sz w:val="22"/>
-            <w:lang w:val="pt-BR"/>
-          </w:rPr>
-          <w:t>ms</w:t>
+          <w:t>Microsoft Teams</w:t>
         </w:r>
       </w:hyperlink>
     </w:p>
@@ -2161,7 +2125,31 @@
           <w:sz w:val="22"/>
           <w:lang w:val="pt-BR"/>
         </w:rPr>
-        <w:t xml:space="preserve">SOUZA, Celina. Políticas públicas: uma revisão da literatura. Sociologia, Porto Alegre, ano 8, n. 16, </w:t>
+        <w:t xml:space="preserve">SOUZA, Celina. </w:t>
+      </w:r>
+      <w:r>
+        <w:rPr>
+          <w:rFonts w:ascii="Arial" w:hAnsi="Arial" w:cs="Arial"/>
+          <w:sz w:val="22"/>
+          <w:lang w:val="pt-BR"/>
+        </w:rPr>
+        <w:t>2006</w:t>
+      </w:r>
+      <w:r>
+        <w:rPr>
+          <w:rFonts w:ascii="Arial" w:hAnsi="Arial" w:cs="Arial"/>
+          <w:sz w:val="22"/>
+          <w:lang w:val="pt-BR"/>
+        </w:rPr>
+        <w:t xml:space="preserve">. </w:t>
+      </w:r>
+      <w:r>
+        <w:rPr>
+          <w:rFonts w:ascii="Arial" w:hAnsi="Arial" w:cs="Arial"/>
+          <w:sz w:val="22"/>
+          <w:lang w:val="pt-BR"/>
+        </w:rPr>
+        <w:t xml:space="preserve">Políticas públicas: uma revisão da literatura. Sociologia, Porto Alegre, ano 8, n. 16, </w:t>
       </w:r>
       <w:proofErr w:type="spellStart"/>
       <w:r>
@@ -2179,7 +2167,7 @@
           <w:sz w:val="22"/>
           <w:lang w:val="pt-BR"/>
         </w:rPr>
-        <w:t>/dez 2006, p. 20-45.</w:t>
+        <w:t>/dez, p. 20-45.</w:t>
       </w:r>
       <w:r>
         <w:rPr>
@@ -2205,7 +2193,31 @@
           <w:sz w:val="22"/>
           <w:lang w:val="pt-BR"/>
         </w:rPr>
-        <w:t>*FREY, Klaus. Políticas públicas: um debate conceitual e reflexões referentes à prática da análise de políticas públicas no Brasil. Planejamento e políticas públicas, n. 21, 2009.</w:t>
+        <w:t xml:space="preserve">*FREY, Klaus. </w:t>
+      </w:r>
+      <w:r>
+        <w:rPr>
+          <w:rFonts w:ascii="Arial" w:hAnsi="Arial" w:cs="Arial"/>
+          <w:sz w:val="22"/>
+          <w:lang w:val="pt-BR"/>
+        </w:rPr>
+        <w:t>200</w:t>
+      </w:r>
+      <w:r>
+        <w:rPr>
+          <w:rFonts w:ascii="Arial" w:hAnsi="Arial" w:cs="Arial"/>
+          <w:sz w:val="22"/>
+          <w:lang w:val="pt-BR"/>
+        </w:rPr>
+        <w:t xml:space="preserve">0. </w:t>
+      </w:r>
+      <w:r>
+        <w:rPr>
+          <w:rFonts w:ascii="Arial" w:hAnsi="Arial" w:cs="Arial"/>
+          <w:sz w:val="22"/>
+          <w:lang w:val="pt-BR"/>
+        </w:rPr>
+        <w:t>Políticas públicas: um debate conceitual e reflexões referentes à prática da análise de políticas públicas no Brasil. Planejamento e políticas públicas, n. 21.</w:t>
       </w:r>
     </w:p>
     <w:p>
@@ -2325,7 +2337,31 @@
           <w:sz w:val="22"/>
           <w:lang w:val="pt-BR"/>
         </w:rPr>
-        <w:t>RUA, Maria das Graças. Análise de Políticas Públicas: conceitos básicos. In: RUA, Mª das Graças &amp; CARVALHO, Mª Izabel V. (</w:t>
+        <w:t xml:space="preserve">RUA, Maria das Graças. </w:t>
+      </w:r>
+      <w:r>
+        <w:rPr>
+          <w:rFonts w:ascii="Arial" w:hAnsi="Arial" w:cs="Arial"/>
+          <w:sz w:val="22"/>
+          <w:lang w:val="pt-BR"/>
+        </w:rPr>
+        <w:t>1998</w:t>
+      </w:r>
+      <w:r>
+        <w:rPr>
+          <w:rFonts w:ascii="Arial" w:hAnsi="Arial" w:cs="Arial"/>
+          <w:sz w:val="22"/>
+          <w:lang w:val="pt-BR"/>
+        </w:rPr>
+        <w:t xml:space="preserve">. </w:t>
+      </w:r>
+      <w:r>
+        <w:rPr>
+          <w:rFonts w:ascii="Arial" w:hAnsi="Arial" w:cs="Arial"/>
+          <w:sz w:val="22"/>
+          <w:lang w:val="pt-BR"/>
+        </w:rPr>
+        <w:t>Análise de Políticas Públicas: conceitos básicos. In: RUA, Mª das Graças &amp; CARVALHO, Mª Izabel V. (</w:t>
       </w:r>
       <w:proofErr w:type="spellStart"/>
       <w:r>
@@ -2343,7 +2379,7 @@
           <w:sz w:val="22"/>
           <w:lang w:val="pt-BR"/>
         </w:rPr>
-        <w:t>). O estudo da política. Brasília: Paralelo 15, 1998.</w:t>
+        <w:t>). O estudo da política. Brasília: Paralelo 15.</w:t>
       </w:r>
       <w:r>
         <w:rPr>
@@ -2501,7 +2537,156 @@
           <w:sz w:val="22"/>
           <w:lang w:val="pt-BR"/>
         </w:rPr>
-        <w:t>CAPELLA, Ana Cláudia. Perspectivas teóricas sobre o processo de formulação de políticas públicas. In: HOCHMAN, Gilberto; ARRETCHE, Marta; MARQUES, Eduardo. Políticas Públicas no Brasil. Rio de Janeiro: FIOCRUZ, 2007.</w:t>
+        <w:t xml:space="preserve">CAPELLA, Ana Cláudia. </w:t>
+      </w:r>
+      <w:r>
+        <w:rPr>
+          <w:rFonts w:ascii="Arial" w:hAnsi="Arial" w:cs="Arial"/>
+          <w:sz w:val="22"/>
+          <w:lang w:val="pt-BR"/>
+        </w:rPr>
+        <w:t>2007</w:t>
+      </w:r>
+      <w:r>
+        <w:rPr>
+          <w:rFonts w:ascii="Arial" w:hAnsi="Arial" w:cs="Arial"/>
+          <w:sz w:val="22"/>
+          <w:lang w:val="pt-BR"/>
+        </w:rPr>
+        <w:t xml:space="preserve">. </w:t>
+      </w:r>
+      <w:r>
+        <w:rPr>
+          <w:rFonts w:ascii="Arial" w:hAnsi="Arial" w:cs="Arial"/>
+          <w:sz w:val="22"/>
+          <w:lang w:val="pt-BR"/>
+        </w:rPr>
+        <w:t>Perspectivas teóricas sobre o processo de formulação de políticas públicas. In: HOCHMAN, Gilberto; ARRETCHE, Marta; MARQUES, Eduardo. Políticas Públicas no Brasil. Rio de Janeiro: FIOCRUZ.</w:t>
+      </w:r>
+    </w:p>
+    <w:p>
+      <w:pPr>
+        <w:keepLines/>
+        <w:pBdr>
+          <w:bottom w:val="single" w:sz="12" w:space="1" w:color="auto"/>
+        </w:pBdr>
+        <w:rPr>
+          <w:rFonts w:ascii="Arial" w:hAnsi="Arial" w:cs="Arial"/>
+          <w:sz w:val="22"/>
+          <w:lang w:val="pt-BR"/>
+        </w:rPr>
+      </w:pPr>
+    </w:p>
+    <w:p>
+      <w:pPr>
+        <w:keepLines/>
+        <w:pBdr>
+          <w:bottom w:val="single" w:sz="12" w:space="1" w:color="auto"/>
+        </w:pBdr>
+        <w:rPr>
+          <w:rFonts w:ascii="Arial" w:hAnsi="Arial" w:cs="Arial"/>
+          <w:sz w:val="22"/>
+          <w:lang w:val="pt-BR"/>
+        </w:rPr>
+      </w:pPr>
+      <w:r>
+        <w:rPr>
+          <w:rFonts w:ascii="Arial" w:hAnsi="Arial" w:cs="Arial"/>
+          <w:sz w:val="22"/>
+        </w:rPr>
+        <w:t>*</w:t>
+      </w:r>
+      <w:r>
+        <w:rPr>
+          <w:rFonts w:ascii="Arial" w:hAnsi="Arial" w:cs="Arial"/>
+          <w:color w:val="222222"/>
+          <w:sz w:val="22"/>
+          <w:shd w:val="clear" w:color="auto" w:fill="FFFFFF"/>
+        </w:rPr>
+        <w:t>HERWEG</w:t>
+      </w:r>
+      <w:r>
+        <w:rPr>
+          <w:rFonts w:ascii="Arial" w:hAnsi="Arial" w:cs="Arial"/>
+          <w:color w:val="222222"/>
+          <w:sz w:val="22"/>
+          <w:shd w:val="clear" w:color="auto" w:fill="FFFFFF"/>
+        </w:rPr>
+        <w:t xml:space="preserve">, N., </w:t>
+      </w:r>
+      <w:r>
+        <w:rPr>
+          <w:rFonts w:ascii="Arial" w:hAnsi="Arial" w:cs="Arial"/>
+          <w:color w:val="222222"/>
+          <w:sz w:val="22"/>
+          <w:shd w:val="clear" w:color="auto" w:fill="FFFFFF"/>
+        </w:rPr>
+        <w:t>ZAHARIADIS</w:t>
+      </w:r>
+      <w:r>
+        <w:rPr>
+          <w:rFonts w:ascii="Arial" w:hAnsi="Arial" w:cs="Arial"/>
+          <w:color w:val="222222"/>
+          <w:sz w:val="22"/>
+          <w:shd w:val="clear" w:color="auto" w:fill="FFFFFF"/>
+        </w:rPr>
+        <w:t xml:space="preserve">, N. and </w:t>
+      </w:r>
+      <w:r>
+        <w:rPr>
+          <w:rFonts w:ascii="Arial" w:hAnsi="Arial" w:cs="Arial"/>
+          <w:color w:val="222222"/>
+          <w:sz w:val="22"/>
+          <w:shd w:val="clear" w:color="auto" w:fill="FFFFFF"/>
+        </w:rPr>
+        <w:t>ZOHLNHÖFER</w:t>
+      </w:r>
+      <w:r>
+        <w:rPr>
+          <w:rFonts w:ascii="Arial" w:hAnsi="Arial" w:cs="Arial"/>
+          <w:color w:val="222222"/>
+          <w:sz w:val="22"/>
+          <w:shd w:val="clear" w:color="auto" w:fill="FFFFFF"/>
+        </w:rPr>
+        <w:t xml:space="preserve">, R., </w:t>
+      </w:r>
+      <w:r>
+        <w:rPr>
+          <w:rFonts w:ascii="Arial" w:hAnsi="Arial" w:cs="Arial"/>
+          <w:color w:val="222222"/>
+          <w:sz w:val="22"/>
+          <w:shd w:val="clear" w:color="auto" w:fill="FFFFFF"/>
+        </w:rPr>
+        <w:t>2023</w:t>
+      </w:r>
+      <w:r>
+        <w:rPr>
+          <w:rFonts w:ascii="Arial" w:hAnsi="Arial" w:cs="Arial"/>
+          <w:color w:val="222222"/>
+          <w:sz w:val="22"/>
+          <w:shd w:val="clear" w:color="auto" w:fill="FFFFFF"/>
+        </w:rPr>
+        <w:t>. The multiple streams framework: Foundations, refinements, and empirical applications. </w:t>
+      </w:r>
+      <w:r>
+        <w:rPr>
+          <w:rFonts w:ascii="Arial" w:hAnsi="Arial" w:cs="Arial"/>
+          <w:i/>
+          <w:iCs/>
+          <w:color w:val="222222"/>
+          <w:sz w:val="22"/>
+          <w:shd w:val="clear" w:color="auto" w:fill="FFFFFF"/>
+        </w:rPr>
+        <w:t>Theories of the policy process</w:t>
+      </w:r>
+      <w:r>
+        <w:rPr>
+          <w:rFonts w:ascii="Arial" w:hAnsi="Arial" w:cs="Arial"/>
+          <w:color w:val="222222"/>
+          <w:sz w:val="22"/>
+          <w:shd w:val="clear" w:color="auto" w:fill="FFFFFF"/>
+        </w:rPr>
+        <w:t>.</w:t>
       </w:r>
       <w:r>
         <w:rPr>
@@ -2612,6 +2797,214 @@
           <w:lang w:val="pt-BR"/>
         </w:rPr>
         <w:t>CAPELLA, Ana Cláudia. Perspectivas teóricas sobre o processo de formulação de políticas públicas. In: HOCHMAN, Gilberto; ARRETCHE, Marta; MARQUES, Eduardo. Políticas Públicas no Brasil. Rio de Janeiro: FIOCRUZ, 2007.</w:t>
+      </w:r>
+    </w:p>
+    <w:p>
+      <w:pPr>
+        <w:keepNext/>
+        <w:pBdr>
+          <w:bottom w:val="single" w:sz="12" w:space="1" w:color="auto"/>
+        </w:pBdr>
+        <w:rPr>
+          <w:rFonts w:ascii="Arial" w:hAnsi="Arial" w:cs="Arial"/>
+          <w:sz w:val="22"/>
+          <w:lang w:val="pt-BR"/>
+        </w:rPr>
+      </w:pPr>
+    </w:p>
+    <w:p>
+      <w:pPr>
+        <w:keepNext/>
+        <w:pBdr>
+          <w:bottom w:val="single" w:sz="12" w:space="1" w:color="auto"/>
+        </w:pBdr>
+        <w:rPr>
+          <w:rFonts w:ascii="Arial" w:hAnsi="Arial" w:cs="Arial"/>
+          <w:sz w:val="22"/>
+        </w:rPr>
+      </w:pPr>
+      <w:r>
+        <w:rPr>
+          <w:rFonts w:ascii="Arial" w:hAnsi="Arial" w:cs="Arial"/>
+          <w:sz w:val="22"/>
+        </w:rPr>
+        <w:t>*</w:t>
+      </w:r>
+      <w:r>
+        <w:rPr>
+          <w:rFonts w:ascii="Arial" w:hAnsi="Arial" w:cs="Arial"/>
+          <w:sz w:val="22"/>
+        </w:rPr>
+        <w:t>JONES</w:t>
+      </w:r>
+      <w:r>
+        <w:rPr>
+          <w:rFonts w:ascii="Arial" w:hAnsi="Arial" w:cs="Arial"/>
+          <w:sz w:val="22"/>
+        </w:rPr>
+        <w:t xml:space="preserve">, B.D., </w:t>
+      </w:r>
+      <w:r>
+        <w:rPr>
+          <w:rFonts w:ascii="Arial" w:hAnsi="Arial" w:cs="Arial"/>
+          <w:sz w:val="22"/>
+        </w:rPr>
+        <w:t>BAUMGARTNER</w:t>
+      </w:r>
+      <w:r>
+        <w:rPr>
+          <w:rFonts w:ascii="Arial" w:hAnsi="Arial" w:cs="Arial"/>
+          <w:sz w:val="22"/>
+        </w:rPr>
+        <w:t xml:space="preserve">, F.R. and </w:t>
+      </w:r>
+      <w:r>
+        <w:rPr>
+          <w:rFonts w:ascii="Arial" w:hAnsi="Arial" w:cs="Arial"/>
+          <w:sz w:val="22"/>
+        </w:rPr>
+        <w:t>TRUE</w:t>
+      </w:r>
+      <w:r>
+        <w:rPr>
+          <w:rFonts w:ascii="Arial" w:hAnsi="Arial" w:cs="Arial"/>
+          <w:sz w:val="22"/>
+        </w:rPr>
+        <w:t>, J.L., 1998. Policy punctuations: US budget authority, 1947-1995. </w:t>
+      </w:r>
+      <w:r>
+        <w:rPr>
+          <w:rFonts w:ascii="Arial" w:hAnsi="Arial" w:cs="Arial"/>
+          <w:i/>
+          <w:iCs/>
+          <w:sz w:val="22"/>
+        </w:rPr>
+        <w:t>The Journal of Politics</w:t>
+      </w:r>
+      <w:r>
+        <w:rPr>
+          <w:rFonts w:ascii="Arial" w:hAnsi="Arial" w:cs="Arial"/>
+          <w:sz w:val="22"/>
+        </w:rPr>
+        <w:t>, </w:t>
+      </w:r>
+      <w:r>
+        <w:rPr>
+          <w:rFonts w:ascii="Arial" w:hAnsi="Arial" w:cs="Arial"/>
+          <w:i/>
+          <w:iCs/>
+          <w:sz w:val="22"/>
+        </w:rPr>
+        <w:t>60</w:t>
+      </w:r>
+      <w:r>
+        <w:rPr>
+          <w:rFonts w:ascii="Arial" w:hAnsi="Arial" w:cs="Arial"/>
+          <w:sz w:val="22"/>
+        </w:rPr>
+        <w:t>(1), pp.1-33.</w:t>
+      </w:r>
+    </w:p>
+    <w:p>
+      <w:pPr>
+        <w:keepNext/>
+        <w:pBdr>
+          <w:bottom w:val="single" w:sz="12" w:space="1" w:color="auto"/>
+        </w:pBdr>
+        <w:rPr>
+          <w:rFonts w:ascii="Arial" w:hAnsi="Arial" w:cs="Arial"/>
+          <w:sz w:val="22"/>
+          <w:lang w:val="pt-BR"/>
+        </w:rPr>
+      </w:pPr>
+      <w:r>
+        <w:rPr>
+          <w:rFonts w:ascii="Arial" w:hAnsi="Arial" w:cs="Arial"/>
+          <w:sz w:val="22"/>
+        </w:rPr>
+        <w:t>*</w:t>
+      </w:r>
+      <w:r>
+        <w:rPr>
+          <w:rFonts w:ascii="Arial" w:hAnsi="Arial" w:cs="Arial"/>
+          <w:color w:val="222222"/>
+          <w:sz w:val="20"/>
+          <w:szCs w:val="20"/>
+          <w:shd w:val="clear" w:color="auto" w:fill="FFFFFF"/>
+        </w:rPr>
+        <w:t xml:space="preserve"> </w:t>
+      </w:r>
+      <w:r>
+        <w:rPr>
+          <w:rFonts w:ascii="Arial" w:hAnsi="Arial" w:cs="Arial"/>
+          <w:sz w:val="22"/>
+        </w:rPr>
+        <w:t>BAUMGARTNER</w:t>
+      </w:r>
+      <w:r>
+        <w:rPr>
+          <w:rFonts w:ascii="Arial" w:hAnsi="Arial" w:cs="Arial"/>
+          <w:sz w:val="22"/>
+        </w:rPr>
+        <w:t xml:space="preserve">, F.R., </w:t>
+      </w:r>
+      <w:r>
+        <w:rPr>
+          <w:rFonts w:ascii="Arial" w:hAnsi="Arial" w:cs="Arial"/>
+          <w:sz w:val="22"/>
+        </w:rPr>
+        <w:t>JONES</w:t>
+      </w:r>
+      <w:r>
+        <w:rPr>
+          <w:rFonts w:ascii="Arial" w:hAnsi="Arial" w:cs="Arial"/>
+          <w:sz w:val="22"/>
+        </w:rPr>
+        <w:t xml:space="preserve">, B.D. and </w:t>
+      </w:r>
+      <w:r>
+        <w:rPr>
+          <w:rFonts w:ascii="Arial" w:hAnsi="Arial" w:cs="Arial"/>
+          <w:sz w:val="22"/>
+        </w:rPr>
+        <w:t>MORTENSEN</w:t>
+      </w:r>
+      <w:r>
+        <w:rPr>
+          <w:rFonts w:ascii="Arial" w:hAnsi="Arial" w:cs="Arial"/>
+          <w:sz w:val="22"/>
+        </w:rPr>
+        <w:t xml:space="preserve">, P.B., </w:t>
+      </w:r>
+      <w:r>
+        <w:rPr>
+          <w:rFonts w:ascii="Arial" w:hAnsi="Arial" w:cs="Arial"/>
+          <w:sz w:val="22"/>
+        </w:rPr>
+        <w:t>2023</w:t>
+      </w:r>
+      <w:r>
+        <w:rPr>
+          <w:rFonts w:ascii="Arial" w:hAnsi="Arial" w:cs="Arial"/>
+          <w:sz w:val="22"/>
+        </w:rPr>
+        <w:t>. Punctuated equilibrium theory: Explaining stability and change in public policymaking. </w:t>
+      </w:r>
+      <w:r>
+        <w:rPr>
+          <w:rFonts w:ascii="Arial" w:hAnsi="Arial" w:cs="Arial"/>
+          <w:i/>
+          <w:iCs/>
+          <w:sz w:val="22"/>
+        </w:rPr>
+        <w:t>Theories of the policy process</w:t>
+      </w:r>
+      <w:r>
+        <w:rPr>
+          <w:rFonts w:ascii="Arial" w:hAnsi="Arial" w:cs="Arial"/>
+          <w:sz w:val="22"/>
+        </w:rPr>
+        <w:t>.</w:t>
       </w:r>
       <w:r>
         <w:rPr>
@@ -3067,7 +3460,23 @@
           <w:sz w:val="22"/>
           <w:lang w:val="pt-BR"/>
         </w:rPr>
-        <w:t xml:space="preserve">HAM, Chistopher e HILL, Michael. Rumo a Teoria da Implementação? In: O processo de elaboração de políticas no Estado capitalista moderno. </w:t>
+        <w:t xml:space="preserve">HAM, Chistopher e HILL, Michael. Rumo a Teoria da Implementação? </w:t>
+      </w:r>
+      <w:r>
+        <w:rPr>
+          <w:rFonts w:ascii="Arial" w:hAnsi="Arial" w:cs="Arial"/>
+          <w:sz w:val="22"/>
+          <w:lang w:val="pt-BR"/>
+        </w:rPr>
+        <w:t xml:space="preserve">1993. </w:t>
+      </w:r>
+      <w:r>
+        <w:rPr>
+          <w:rFonts w:ascii="Arial" w:hAnsi="Arial" w:cs="Arial"/>
+          <w:sz w:val="22"/>
+          <w:lang w:val="pt-BR"/>
+        </w:rPr>
+        <w:t xml:space="preserve">In: O processo de elaboração de políticas no Estado capitalista moderno. </w:t>
       </w:r>
       <w:proofErr w:type="spellStart"/>
       <w:r>
@@ -3103,7 +3512,23 @@
           <w:sz w:val="22"/>
           <w:lang w:val="pt-BR"/>
         </w:rPr>
-        <w:t>, Londres 1993.</w:t>
+        <w:t>, Londre</w:t>
+      </w:r>
+      <w:r>
+        <w:rPr>
+          <w:rFonts w:ascii="Arial" w:hAnsi="Arial" w:cs="Arial"/>
+          <w:sz w:val="22"/>
+          <w:lang w:val="pt-BR"/>
+        </w:rPr>
+        <w:t>s</w:t>
+      </w:r>
+      <w:r>
+        <w:rPr>
+          <w:rFonts w:ascii="Arial" w:hAnsi="Arial" w:cs="Arial"/>
+          <w:sz w:val="22"/>
+          <w:lang w:val="pt-BR"/>
+        </w:rPr>
+        <w:t>.</w:t>
       </w:r>
     </w:p>
     <w:p>
@@ -3217,62 +3642,136 @@
     <w:p>
       <w:pPr>
         <w:keepLines/>
-        <w:ind w:left="283" w:hanging="283"/>
-        <w:rPr>
-          <w:rFonts w:ascii="Arial" w:hAnsi="Arial" w:cs="Arial"/>
-          <w:sz w:val="22"/>
-          <w:lang w:val="pt-BR"/>
-        </w:rPr>
-      </w:pPr>
-      <w:r>
-        <w:rPr>
-          <w:rFonts w:ascii="Arial" w:hAnsi="Arial" w:cs="Arial"/>
-          <w:sz w:val="22"/>
-          <w:lang w:val="pt-BR"/>
-        </w:rPr>
-        <w:t>STEIN, Ernesto et al. A política das políticas públicas: progresso econômico e social na América Latina. Relatório 2006. Ed. Campus, 2ª edição. Capítulo 2. Para compreender a política das políticas públicas: uma abordagem metodológica.</w:t>
+        <w:rPr>
+          <w:rFonts w:ascii="Arial" w:hAnsi="Arial" w:cs="Arial"/>
+          <w:sz w:val="22"/>
+          <w:lang w:val="pt-BR"/>
+        </w:rPr>
+      </w:pPr>
+      <w:r>
+        <w:rPr>
+          <w:rFonts w:ascii="Arial" w:hAnsi="Arial" w:cs="Arial"/>
+          <w:sz w:val="22"/>
+          <w:lang w:val="pt-BR"/>
+        </w:rPr>
+        <w:t>STEIN, Ernesto</w:t>
+      </w:r>
+      <w:r>
+        <w:rPr>
+          <w:rFonts w:ascii="Arial" w:hAnsi="Arial" w:cs="Arial"/>
+          <w:sz w:val="22"/>
+          <w:lang w:val="pt-BR"/>
+        </w:rPr>
+        <w:t>, TOMMASI, Mariano</w:t>
+      </w:r>
+      <w:r>
+        <w:rPr>
+          <w:rFonts w:ascii="Arial" w:hAnsi="Arial" w:cs="Arial"/>
+          <w:sz w:val="22"/>
+          <w:lang w:val="pt-BR"/>
+        </w:rPr>
+        <w:t>.</w:t>
+      </w:r>
+      <w:r>
+        <w:rPr>
+          <w:rFonts w:ascii="Arial" w:hAnsi="Arial" w:cs="Arial"/>
+          <w:sz w:val="22"/>
+          <w:lang w:val="pt-BR"/>
+        </w:rPr>
+        <w:t xml:space="preserve"> 2006</w:t>
+      </w:r>
+      <w:r>
+        <w:rPr>
+          <w:rFonts w:ascii="Arial" w:hAnsi="Arial" w:cs="Arial"/>
+          <w:sz w:val="22"/>
+          <w:lang w:val="pt-BR"/>
+        </w:rPr>
+        <w:t>a.</w:t>
+      </w:r>
+      <w:r>
+        <w:rPr>
+          <w:rFonts w:ascii="Arial" w:hAnsi="Arial" w:cs="Arial"/>
+          <w:sz w:val="22"/>
+          <w:lang w:val="pt-BR"/>
+        </w:rPr>
+        <w:t xml:space="preserve"> A política das políticas públicas: progresso econômico e social na América Latina.</w:t>
+      </w:r>
+      <w:r>
+        <w:rPr>
+          <w:rFonts w:ascii="Arial" w:hAnsi="Arial" w:cs="Arial"/>
+          <w:sz w:val="22"/>
+          <w:lang w:val="pt-BR"/>
+        </w:rPr>
+        <w:t xml:space="preserve"> In:</w:t>
+      </w:r>
+      <w:r>
+        <w:rPr>
+          <w:rFonts w:ascii="Arial" w:hAnsi="Arial" w:cs="Arial"/>
+          <w:sz w:val="22"/>
+          <w:lang w:val="pt-BR"/>
+        </w:rPr>
+        <w:t xml:space="preserve"> Para compreender a política das políticas públicas: uma abordagem metodológica.</w:t>
       </w:r>
     </w:p>
     <w:p>
       <w:pPr>
         <w:keepLines/>
-        <w:ind w:left="283" w:hanging="283"/>
-        <w:rPr>
-          <w:rFonts w:ascii="Arial" w:hAnsi="Arial" w:cs="Arial"/>
-          <w:sz w:val="22"/>
-          <w:lang w:val="pt-BR"/>
-        </w:rPr>
-      </w:pPr>
+        <w:rPr>
+          <w:rFonts w:ascii="Arial" w:hAnsi="Arial" w:cs="Arial"/>
+          <w:sz w:val="22"/>
+        </w:rPr>
+      </w:pPr>
+      <w:r>
+        <w:rPr>
+          <w:rFonts w:ascii="Arial" w:hAnsi="Arial" w:cs="Arial"/>
+          <w:sz w:val="22"/>
+        </w:rPr>
+        <w:lastRenderedPageBreak/>
+        <w:br/>
+      </w:r>
     </w:p>
     <w:p>
       <w:pPr>
         <w:keepLines/>
-        <w:ind w:left="283" w:hanging="283"/>
-        <w:rPr>
-          <w:rFonts w:ascii="Arial" w:hAnsi="Arial" w:cs="Arial"/>
-          <w:sz w:val="22"/>
-        </w:rPr>
-      </w:pPr>
-      <w:r>
-        <w:rPr>
-          <w:rFonts w:ascii="Arial" w:hAnsi="Arial" w:cs="Arial"/>
-          <w:sz w:val="22"/>
-        </w:rPr>
-        <w:t xml:space="preserve">* </w:t>
-      </w:r>
-      <w:r>
-        <w:rPr>
-          <w:rFonts w:ascii="Arial" w:hAnsi="Arial" w:cs="Arial"/>
-          <w:sz w:val="22"/>
-        </w:rPr>
-        <w:t>PIERSON, P. “Public policies as institutions”. In: SHAPIRO, I.; SKOWRONEK, S.; GALVIN, D. (eds.). Rethinking political institutions: the art of the state. New York University Press, 2006.</w:t>
-      </w:r>
-      <w:r>
-        <w:rPr>
-          <w:rFonts w:ascii="Arial" w:hAnsi="Arial" w:cs="Arial"/>
-          <w:sz w:val="22"/>
-        </w:rPr>
-        <w:br/>
+        <w:rPr>
+          <w:rFonts w:ascii="Arial" w:hAnsi="Arial" w:cs="Arial"/>
+          <w:sz w:val="22"/>
+        </w:rPr>
+      </w:pPr>
+      <w:r>
+        <w:rPr>
+          <w:rFonts w:ascii="Arial" w:hAnsi="Arial" w:cs="Arial"/>
+          <w:sz w:val="22"/>
+        </w:rPr>
+        <w:t xml:space="preserve">* PIERSON, P. </w:t>
+      </w:r>
+      <w:r>
+        <w:rPr>
+          <w:rFonts w:ascii="Arial" w:hAnsi="Arial" w:cs="Arial"/>
+          <w:sz w:val="22"/>
+        </w:rPr>
+        <w:t>2000</w:t>
+      </w:r>
+      <w:r>
+        <w:rPr>
+          <w:rFonts w:ascii="Arial" w:hAnsi="Arial" w:cs="Arial"/>
+          <w:sz w:val="22"/>
+        </w:rPr>
+        <w:t xml:space="preserve">. </w:t>
+      </w:r>
+      <w:r>
+        <w:rPr>
+          <w:rFonts w:ascii="Arial" w:hAnsi="Arial" w:cs="Arial"/>
+          <w:sz w:val="22"/>
+        </w:rPr>
+        <w:t xml:space="preserve">Increasing Returns, Path Dependence, and the Study of Politics. </w:t>
+      </w:r>
+      <w:r>
+        <w:rPr>
+          <w:rFonts w:ascii="Arial" w:hAnsi="Arial" w:cs="Arial"/>
+          <w:sz w:val="22"/>
+        </w:rPr>
+        <w:t>American Political Science Review, vol. 94, n. 2, June.</w:t>
       </w:r>
     </w:p>
     <w:p>
@@ -3284,57 +3783,122 @@
           <w:lang w:val="pt-BR"/>
         </w:rPr>
       </w:pPr>
-      <w:r>
-        <w:rPr>
-          <w:rFonts w:ascii="Arial" w:hAnsi="Arial" w:cs="Arial"/>
-          <w:sz w:val="22"/>
-        </w:rPr>
-        <w:t xml:space="preserve">* PIERSON, P. Increasing Returns, Path Dependence, and the Study of Politics. </w:t>
-      </w:r>
-      <w:r>
-        <w:rPr>
-          <w:rFonts w:ascii="Arial" w:hAnsi="Arial" w:cs="Arial"/>
-          <w:sz w:val="22"/>
-          <w:lang w:val="pt-BR"/>
-        </w:rPr>
-        <w:t xml:space="preserve">American </w:t>
-      </w:r>
-      <w:proofErr w:type="spellStart"/>
-      <w:r>
-        <w:rPr>
-          <w:rFonts w:ascii="Arial" w:hAnsi="Arial" w:cs="Arial"/>
-          <w:sz w:val="22"/>
-          <w:lang w:val="pt-BR"/>
-        </w:rPr>
-        <w:t>Political</w:t>
-      </w:r>
-      <w:proofErr w:type="spellEnd"/>
-      <w:r>
-        <w:rPr>
-          <w:rFonts w:ascii="Arial" w:hAnsi="Arial" w:cs="Arial"/>
-          <w:sz w:val="22"/>
-          <w:lang w:val="pt-BR"/>
-        </w:rPr>
-        <w:t xml:space="preserve"> Science Review, vol. 94, n. 2, </w:t>
-      </w:r>
-      <w:proofErr w:type="spellStart"/>
-      <w:r>
-        <w:rPr>
-          <w:rFonts w:ascii="Arial" w:hAnsi="Arial" w:cs="Arial"/>
-          <w:sz w:val="22"/>
-          <w:lang w:val="pt-BR"/>
-        </w:rPr>
-        <w:t>June</w:t>
-      </w:r>
-      <w:proofErr w:type="spellEnd"/>
-      <w:r>
-        <w:rPr>
-          <w:rFonts w:ascii="Arial" w:hAnsi="Arial" w:cs="Arial"/>
-          <w:sz w:val="22"/>
-          <w:lang w:val="pt-BR"/>
-        </w:rPr>
-        <w:t xml:space="preserve"> 2000.</w:t>
-      </w:r>
+    </w:p>
+    <w:p>
+      <w:pPr>
+        <w:keepLines/>
+        <w:rPr>
+          <w:rFonts w:ascii="Arial" w:hAnsi="Arial" w:cs="Arial"/>
+          <w:sz w:val="22"/>
+          <w:lang w:val="pt-BR"/>
+        </w:rPr>
+      </w:pPr>
+      <w:r>
+        <w:rPr>
+          <w:rFonts w:ascii="Arial" w:hAnsi="Arial" w:cs="Arial"/>
+          <w:sz w:val="22"/>
+          <w:lang w:val="pt-BR"/>
+        </w:rPr>
+        <w:t>*</w:t>
+      </w:r>
+      <w:r>
+        <w:rPr>
+          <w:rFonts w:ascii="Arial" w:hAnsi="Arial" w:cs="Arial"/>
+          <w:sz w:val="22"/>
+          <w:lang w:val="pt-BR"/>
+        </w:rPr>
+        <w:t>STEIN, Ernesto</w:t>
+      </w:r>
+      <w:r>
+        <w:rPr>
+          <w:rFonts w:ascii="Arial" w:hAnsi="Arial" w:cs="Arial"/>
+          <w:sz w:val="22"/>
+          <w:lang w:val="pt-BR"/>
+        </w:rPr>
+        <w:t>, TOMMASI, Mariano</w:t>
+      </w:r>
+      <w:r>
+        <w:rPr>
+          <w:rFonts w:ascii="Arial" w:hAnsi="Arial" w:cs="Arial"/>
+          <w:sz w:val="22"/>
+          <w:lang w:val="pt-BR"/>
+        </w:rPr>
+        <w:t>.</w:t>
+      </w:r>
+      <w:r>
+        <w:rPr>
+          <w:rFonts w:ascii="Arial" w:hAnsi="Arial" w:cs="Arial"/>
+          <w:sz w:val="22"/>
+          <w:lang w:val="pt-BR"/>
+        </w:rPr>
+        <w:t xml:space="preserve"> 2006</w:t>
+      </w:r>
+      <w:r>
+        <w:rPr>
+          <w:rFonts w:ascii="Arial" w:hAnsi="Arial" w:cs="Arial"/>
+          <w:sz w:val="22"/>
+          <w:lang w:val="pt-BR"/>
+        </w:rPr>
+        <w:t>b</w:t>
+      </w:r>
+      <w:r>
+        <w:rPr>
+          <w:rFonts w:ascii="Arial" w:hAnsi="Arial" w:cs="Arial"/>
+          <w:sz w:val="22"/>
+          <w:lang w:val="pt-BR"/>
+        </w:rPr>
+        <w:t>.</w:t>
+      </w:r>
+      <w:r>
+        <w:rPr>
+          <w:rFonts w:ascii="Arial" w:hAnsi="Arial" w:cs="Arial"/>
+          <w:sz w:val="22"/>
+          <w:lang w:val="pt-BR"/>
+        </w:rPr>
+        <w:t xml:space="preserve"> A política das políticas públicas: progresso econômico e social na América Latina.</w:t>
+      </w:r>
+      <w:r>
+        <w:rPr>
+          <w:rFonts w:ascii="Arial" w:hAnsi="Arial" w:cs="Arial"/>
+          <w:sz w:val="22"/>
+          <w:lang w:val="pt-BR"/>
+        </w:rPr>
+        <w:t xml:space="preserve"> </w:t>
+      </w:r>
+      <w:r>
+        <w:rPr>
+          <w:rFonts w:ascii="Arial" w:hAnsi="Arial" w:cs="Arial"/>
+          <w:sz w:val="22"/>
+          <w:lang w:val="pt-BR"/>
+        </w:rPr>
+        <w:t xml:space="preserve">Capítulos 2 e 6. </w:t>
+      </w:r>
+      <w:r>
+        <w:rPr>
+          <w:rFonts w:ascii="Arial" w:hAnsi="Arial" w:cs="Arial"/>
+          <w:sz w:val="22"/>
+          <w:lang w:val="pt-BR"/>
+        </w:rPr>
+        <w:t>In:</w:t>
+      </w:r>
+      <w:r>
+        <w:rPr>
+          <w:rFonts w:ascii="Arial" w:hAnsi="Arial" w:cs="Arial"/>
+          <w:sz w:val="22"/>
+          <w:lang w:val="pt-BR"/>
+        </w:rPr>
+        <w:t xml:space="preserve"> Para compreender a política das políticas públicas: uma abordagem metodológica.</w:t>
+      </w:r>
+    </w:p>
+    <w:p>
+      <w:pPr>
+        <w:keepLines/>
+        <w:rPr>
+          <w:rFonts w:ascii="Arial" w:hAnsi="Arial" w:cs="Arial"/>
+          <w:sz w:val="22"/>
+          <w:lang w:val="pt-BR"/>
+        </w:rPr>
+      </w:pPr>
     </w:p>
     <w:p>
       <w:pPr>
@@ -3363,36 +3927,6 @@
     </w:p>
     <w:p>
       <w:pPr>
-        <w:keepLines/>
-        <w:rPr>
-          <w:rFonts w:ascii="Arial" w:hAnsi="Arial" w:cs="Arial"/>
-          <w:sz w:val="22"/>
-          <w:lang w:val="pt-BR"/>
-        </w:rPr>
-      </w:pPr>
-    </w:p>
-    <w:p>
-      <w:pPr>
-        <w:keepNext/>
-        <w:rPr>
-          <w:rFonts w:ascii="Arial" w:hAnsi="Arial" w:cs="Arial"/>
-          <w:sz w:val="22"/>
-          <w:lang w:val="pt-BR"/>
-        </w:rPr>
-      </w:pPr>
-    </w:p>
-    <w:p>
-      <w:pPr>
-        <w:keepNext/>
-        <w:rPr>
-          <w:rFonts w:ascii="Arial" w:hAnsi="Arial" w:cs="Arial"/>
-          <w:sz w:val="22"/>
-          <w:lang w:val="pt-BR"/>
-        </w:rPr>
-      </w:pPr>
-    </w:p>
-    <w:p>
-      <w:pPr>
         <w:keepNext/>
         <w:rPr>
           <w:rFonts w:ascii="Arial" w:hAnsi="Arial" w:cs="Arial"/>
@@ -4526,7 +5060,6 @@
     <w:p>
       <w:pPr>
         <w:keepLines/>
-        <w:ind w:left="283" w:hanging="283"/>
         <w:rPr>
           <w:rFonts w:ascii="Arial" w:hAnsi="Arial" w:cs="Arial"/>
           <w:sz w:val="22"/>
@@ -4557,15 +5090,31 @@
           <w:sz w:val="22"/>
           <w:lang w:val="pt-BR"/>
         </w:rPr>
-        <w:t xml:space="preserve"> B.; CAVALCANTE, Pedro; TURGEON, Mathieu. Mecanismos de difusão de políticas sociais no Brasil: uma análise do Programa Saúde da Família. </w:t>
-      </w:r>
-      <w:r>
-        <w:rPr>
-          <w:rFonts w:ascii="Arial" w:hAnsi="Arial" w:cs="Arial"/>
-          <w:sz w:val="22"/>
-          <w:lang w:val="pt-BR"/>
-        </w:rPr>
-        <w:t>Revista de Sociologia e Política. Vol. 24, n. 58, jun. 2016.</w:t>
+        <w:t xml:space="preserve"> B.; CAVALCANTE, Pedro; TURGEON, Mathieu. </w:t>
+      </w:r>
+      <w:r>
+        <w:rPr>
+          <w:rFonts w:ascii="Arial" w:hAnsi="Arial" w:cs="Arial"/>
+          <w:sz w:val="22"/>
+          <w:lang w:val="pt-BR"/>
+        </w:rPr>
+        <w:t xml:space="preserve">2016. </w:t>
+      </w:r>
+      <w:r>
+        <w:rPr>
+          <w:rFonts w:ascii="Arial" w:hAnsi="Arial" w:cs="Arial"/>
+          <w:sz w:val="22"/>
+          <w:lang w:val="pt-BR"/>
+        </w:rPr>
+        <w:t xml:space="preserve">Mecanismos de difusão de políticas sociais no Brasil: uma análise do Programa Saúde da Família. </w:t>
+      </w:r>
+      <w:r>
+        <w:rPr>
+          <w:rFonts w:ascii="Arial" w:hAnsi="Arial" w:cs="Arial"/>
+          <w:sz w:val="22"/>
+          <w:lang w:val="pt-BR"/>
+        </w:rPr>
+        <w:t>Revista de Sociologia e Política. Vol. 24, n. 58, jun.</w:t>
       </w:r>
       <w:r>
         <w:rPr>
@@ -4590,7 +5139,31 @@
           <w:sz w:val="22"/>
           <w:lang w:val="pt-BR"/>
         </w:rPr>
-        <w:t xml:space="preserve">* WAMPLER, Brian. A difusão do Orçamento Participativo brasileiro: “boas práticas” devem ser promovidas? </w:t>
+        <w:t xml:space="preserve">*WAMPLER, Brian. </w:t>
+      </w:r>
+      <w:r>
+        <w:rPr>
+          <w:rFonts w:ascii="Arial" w:hAnsi="Arial" w:cs="Arial"/>
+          <w:sz w:val="22"/>
+          <w:lang w:val="pt-BR"/>
+        </w:rPr>
+        <w:t>2008</w:t>
+      </w:r>
+      <w:r>
+        <w:rPr>
+          <w:rFonts w:ascii="Arial" w:hAnsi="Arial" w:cs="Arial"/>
+          <w:sz w:val="22"/>
+          <w:lang w:val="pt-BR"/>
+        </w:rPr>
+        <w:t xml:space="preserve">. </w:t>
+      </w:r>
+      <w:r>
+        <w:rPr>
+          <w:rFonts w:ascii="Arial" w:hAnsi="Arial" w:cs="Arial"/>
+          <w:sz w:val="22"/>
+          <w:lang w:val="pt-BR"/>
+        </w:rPr>
+        <w:t xml:space="preserve">A difusão do Orçamento Participativo brasileiro: “boas práticas” devem ser promovidas? </w:t>
       </w:r>
       <w:proofErr w:type="spellStart"/>
       <w:r>
@@ -4606,7 +5179,7 @@
           <w:rFonts w:ascii="Arial" w:hAnsi="Arial" w:cs="Arial"/>
           <w:sz w:val="22"/>
         </w:rPr>
-        <w:t xml:space="preserve"> Pública, vol. 14, nº 1, p. 65-95. Campinas, 2008.</w:t>
+        <w:t xml:space="preserve"> Pública, vol. 14, nº 1, p. 65-95. Campinas.</w:t>
       </w:r>
     </w:p>
     <w:p>
@@ -4633,7 +5206,7 @@
           <w:rFonts w:ascii="Arial" w:hAnsi="Arial" w:cs="Arial"/>
           <w:sz w:val="22"/>
         </w:rPr>
-        <w:t xml:space="preserve">* COÊLHO, Denilson B. Political Competition and the Diffusion of Conditional Cash Transfers in Brazil. </w:t>
+        <w:t xml:space="preserve">*COÊLHO, Denilson B. Political Competition and the Diffusion of Conditional Cash Transfers in Brazil. </w:t>
       </w:r>
       <w:proofErr w:type="spellStart"/>
       <w:r>
@@ -4773,6 +5346,14 @@
         </w:rPr>
         <w:t xml:space="preserve">ROCHA, Carlos Vasconcelos. </w:t>
       </w:r>
+      <w:r>
+        <w:rPr>
+          <w:rFonts w:ascii="Arial" w:hAnsi="Arial" w:cs="Arial"/>
+          <w:sz w:val="22"/>
+          <w:lang w:val="pt-BR"/>
+        </w:rPr>
+        <w:t xml:space="preserve">2005. </w:t>
+      </w:r>
       <w:proofErr w:type="spellStart"/>
       <w:r>
         <w:rPr>
@@ -4807,7 +5388,7 @@
           <w:sz w:val="22"/>
           <w:lang w:val="pt-BR"/>
         </w:rPr>
-        <w:t xml:space="preserve"> - Revista de Ciências Sociais, v. 5, n. 1, jan.-jun. 2005.</w:t>
+        <w:t xml:space="preserve"> - Revista de Ciências Sociais, v. 5, n. 1, jan.-jun.</w:t>
       </w:r>
       <w:r>
         <w:rPr>
@@ -7039,7 +7620,6 @@
   <w:style w:type="character" w:default="1" w:styleId="DefaultParagraphFont">
     <w:name w:val="Default Paragraph Font"/>
     <w:uiPriority w:val="1"/>
-    <w:semiHidden/>
     <w:unhideWhenUsed/>
   </w:style>
   <w:style w:type="table" w:default="1" w:styleId="TableNormal">

</xml_diff>